<commit_message>
AMSA: memo da cota extra em DOCX com página A4 e margens definidas
Co-Authored-By: Claude Fable 5.1 <noreply@anthropic.com>
Claude-Session: https://claude.ai/code/session_019evGHksUHfYDfJT9V5YDKF
</commit_message>
<xml_diff>
--- a/consultas/amsa-macico-baturite-2026/memo-cota-extra-estrutura-juridica.docx
+++ b/consultas/amsa-macico-baturite-2026/memo-cota-extra-estrutura-juridica.docx
@@ -945,7 +945,10 @@
     </w:p>
     <w:bookmarkEnd w:id="34"/>
     <w:bookmarkEnd w:id="35"/>
-    <w:sectPr/>
+    <w:sectPr>
+      <w:pgSz w:w="11906" w:h="16838"/>
+      <w:pgMar w:top="1417" w:right="1417" w:bottom="1417" w:left="1417" w:header="708" w:footer="708" w:gutter="0"/>
+    </w:sectPr>
   </w:body>
 </w:document>
 </file>

</xml_diff>